<commit_message>
Make the cover letter fully copy-paste ready
Drops every fill-in: the date line, the salutation placeholder, and the
company sentence. The letter now sends as-is.

The paragraph that named the company is replaced by one saying what kind
of work she wants — true of every submission, and it reads as a position
rather than a blank someone forgot to fill. The closing line carries the
rest of that weight by offering specificity in the conversation instead
of faking it on the page.

Also drops the date, which only goes stale in a folder, and opens with
"Hello," rather than a guessed name or "Dear Hiring Manager."

Still one page.

Co-Authored-By: Claude Opus 5 <noreply@anthropic.com>
Claude-Session: https://claude.ai/code/session_01Ty4rFpn8nqofDf2Eoueg6Y
</commit_message>
<xml_diff>
--- a/resume/Jess-Ferretti-Cover-Letter.docx
+++ b/resume/Jess-Ferretti-Cover-Letter.docx
@@ -76,20 +76,6 @@
     </w:p>
     <w:p>
       <w:pPr>
-        <w:spacing w:after="240"/>
-      </w:pPr>
-      <w:r>
-        <w:rPr>
-          <w:rFonts w:ascii="Calibri" w:cs="Calibri" w:eastAsia="Calibri" w:hAnsi="Calibri"/>
-          <w:color w:val="5A6472"/>
-          <w:sz w:val="21"/>
-          <w:szCs w:val="21"/>
-        </w:rPr>
-        <w:t xml:space="preserve">[Date]</w:t>
-      </w:r>
-    </w:p>
-    <w:p>
-      <w:pPr>
         <w:spacing w:after="120" w:before="120" w:line="290"/>
       </w:pPr>
       <w:r>
@@ -99,7 +85,7 @@
           <w:sz w:val="21"/>
           <w:szCs w:val="21"/>
         </w:rPr>
-        <w:t xml:space="preserve">Dear [Name],</w:t>
+        <w:t xml:space="preserve">Hello,</w:t>
       </w:r>
     </w:p>
     <w:p>
@@ -141,47 +127,7 @@
           <w:sz w:val="21"/>
           <w:szCs w:val="21"/>
         </w:rPr>
-        <w:t xml:space="preserve">What pulled me toward </w:t>
-      </w:r>
-      <w:r>
-        <w:rPr>
-          <w:rFonts w:ascii="Calibri" w:cs="Calibri" w:eastAsia="Calibri" w:hAnsi="Calibri"/>
-          <w:b/>
-          <w:bCs/>
-          <w:color w:val="0F1319"/>
-          <w:sz w:val="21"/>
-          <w:szCs w:val="21"/>
-        </w:rPr>
-        <w:t xml:space="preserve">[Company]</w:t>
-      </w:r>
-      <w:r>
-        <w:rPr>
-          <w:rFonts w:ascii="Calibri" w:cs="Calibri" w:eastAsia="Calibri" w:hAnsi="Calibri"/>
-          <w:color w:val="0F1319"/>
-          <w:sz w:val="21"/>
-          <w:szCs w:val="21"/>
-        </w:rPr>
-        <w:t xml:space="preserve"> is </w:t>
-      </w:r>
-      <w:r>
-        <w:rPr>
-          <w:rFonts w:ascii="Calibri" w:cs="Calibri" w:eastAsia="Calibri" w:hAnsi="Calibri"/>
-          <w:i/>
-          <w:iCs/>
-          <w:color w:val="5A6472"/>
-          <w:sz w:val="21"/>
-          <w:szCs w:val="21"/>
-        </w:rPr>
-        <w:t xml:space="preserve">[one honest sentence — the specific thing you noticed, not a compliment]</w:t>
-      </w:r>
-      <w:r>
-        <w:rPr>
-          <w:rFonts w:ascii="Calibri" w:cs="Calibri" w:eastAsia="Calibri" w:hAnsi="Calibri"/>
-          <w:color w:val="0F1319"/>
-          <w:sz w:val="21"/>
-          <w:szCs w:val="21"/>
-        </w:rPr>
-        <w:t xml:space="preserve">. I would like to be part of it.</w:t>
+        <w:t xml:space="preserve">That is what I am drawn to — work where the commercial answers are not fully written yet, and people willing to say so out loud. Whether that means building something from nothing or fixing the one part of an engine that is stuck, it is the same job to me, and I have never wanted to do anything else.</w:t>
       </w:r>
     </w:p>
     <w:p>
@@ -195,7 +141,7 @@
           <w:sz w:val="21"/>
           <w:szCs w:val="21"/>
         </w:rPr>
-        <w:t xml:space="preserve">You will see on the resume that I am publicly sober and in recovery. I mention it here because it is not a footnote. It is where the directness comes from, and it is why the people I work with tell me the truth about their pipeline early enough for it to matter.</w:t>
+        <w:t xml:space="preserve">You will see on the resume that I am publicly sober and in recovery. I mention it because it is not a footnote. It is where the directness comes from, and it is why the people I work with tell me the truth about their pipeline early enough for it to matter.</w:t>
       </w:r>
     </w:p>
     <w:p>
@@ -209,7 +155,7 @@
           <w:sz w:val="21"/>
           <w:szCs w:val="21"/>
         </w:rPr>
-        <w:t xml:space="preserve">If it seems like there is something here, I would love to talk. Thank you for reading this.</w:t>
+        <w:t xml:space="preserve">I would love to talk, and I would be glad to get specific about your business the moment there is a conversation to have. Thank you for reading this.</w:t>
       </w:r>
     </w:p>
     <w:p>

</xml_diff>